<commit_message>
update loi table khoang trang
</commit_message>
<xml_diff>
--- a/src/main/resources/templates/BaoCaoThongTinVeNguoiCoLienQuan.docx
+++ b/src/main/resources/templates/BaoCaoThongTinVeNguoiCoLienQuan.docx
@@ -175,10 +175,10 @@
       </w:tblPr>
       <w:tblGrid>
         <w:gridCol w:w="1056"/>
-        <w:gridCol w:w="2339"/>
-        <w:gridCol w:w="2725"/>
-        <w:gridCol w:w="1296"/>
-        <w:gridCol w:w="3024"/>
+        <w:gridCol w:w="3084"/>
+        <w:gridCol w:w="2430"/>
+        <w:gridCol w:w="1440"/>
+        <w:gridCol w:w="2430"/>
       </w:tblGrid>
       <w:tr>
         <w:trPr>
@@ -209,7 +209,7 @@
         </w:tc>
         <w:tc>
           <w:tcPr>
-            <w:tcW w:w="2339" w:type="dxa"/>
+            <w:tcW w:w="3084" w:type="dxa"/>
           </w:tcPr>
           <w:p>
             <w:pPr>
@@ -232,7 +232,7 @@
         </w:tc>
         <w:tc>
           <w:tcPr>
-            <w:tcW w:w="2725" w:type="dxa"/>
+            <w:tcW w:w="2430" w:type="dxa"/>
           </w:tcPr>
           <w:p>
             <w:pPr>
@@ -255,7 +255,7 @@
         </w:tc>
         <w:tc>
           <w:tcPr>
-            <w:tcW w:w="1296" w:type="dxa"/>
+            <w:tcW w:w="1440" w:type="dxa"/>
           </w:tcPr>
           <w:p>
             <w:pPr>
@@ -278,7 +278,7 @@
         </w:tc>
         <w:tc>
           <w:tcPr>
-            <w:tcW w:w="3024" w:type="dxa"/>
+            <w:tcW w:w="2430" w:type="dxa"/>
           </w:tcPr>
           <w:p>
             <w:pPr>
@@ -313,15 +313,15 @@
               <w:jc w:val="center"/>
               <w:rPr>
                 <w:rFonts w:ascii="Times New Roman" w:hAnsi="Times New Roman"/>
-                <w:sz w:val="40"/>
-                <w:szCs w:val="40"/>
+                <w:sz w:val="28"/>
+                <w:szCs w:val="28"/>
               </w:rPr>
             </w:pPr>
             <w:r>
               <w:rPr>
                 <w:rFonts w:ascii="Times New Roman" w:hAnsi="Times New Roman"/>
-                <w:sz w:val="40"/>
-                <w:szCs w:val="40"/>
+                <w:sz w:val="28"/>
+                <w:szCs w:val="28"/>
               </w:rPr>
               <w:t>1</w:t>
             </w:r>
@@ -329,52 +329,52 @@
         </w:tc>
         <w:tc>
           <w:tcPr>
-            <w:tcW w:w="2339" w:type="dxa"/>
-          </w:tcPr>
-          <w:p>
-            <w:pPr>
-              <w:rPr>
-                <w:rFonts w:ascii="Times New Roman" w:hAnsi="Times New Roman"/>
-                <w:b/>
-                <w:sz w:val="40"/>
-                <w:szCs w:val="40"/>
-              </w:rPr>
-            </w:pPr>
-          </w:p>
-        </w:tc>
-        <w:tc>
-          <w:tcPr>
-            <w:tcW w:w="2725" w:type="dxa"/>
-          </w:tcPr>
-          <w:p>
-            <w:pPr>
-              <w:rPr>
-                <w:rFonts w:ascii="Times New Roman" w:hAnsi="Times New Roman"/>
-                <w:b/>
-                <w:sz w:val="40"/>
-                <w:szCs w:val="40"/>
-              </w:rPr>
-            </w:pPr>
-          </w:p>
-        </w:tc>
-        <w:tc>
-          <w:tcPr>
-            <w:tcW w:w="1296" w:type="dxa"/>
-          </w:tcPr>
-          <w:p>
-            <w:pPr>
-              <w:rPr>
-                <w:rFonts w:ascii="Times New Roman" w:hAnsi="Times New Roman"/>
-                <w:b/>
-                <w:sz w:val="40"/>
-                <w:szCs w:val="40"/>
-              </w:rPr>
-            </w:pPr>
-          </w:p>
-        </w:tc>
-        <w:tc>
-          <w:tcPr>
-            <w:tcW w:w="3024" w:type="dxa"/>
+            <w:tcW w:w="3084" w:type="dxa"/>
+          </w:tcPr>
+          <w:p>
+            <w:pPr>
+              <w:rPr>
+                <w:rFonts w:ascii="Times New Roman" w:hAnsi="Times New Roman"/>
+                <w:b/>
+                <w:sz w:val="40"/>
+                <w:szCs w:val="40"/>
+              </w:rPr>
+            </w:pPr>
+          </w:p>
+        </w:tc>
+        <w:tc>
+          <w:tcPr>
+            <w:tcW w:w="2430" w:type="dxa"/>
+          </w:tcPr>
+          <w:p>
+            <w:pPr>
+              <w:rPr>
+                <w:rFonts w:ascii="Times New Roman" w:hAnsi="Times New Roman"/>
+                <w:b/>
+                <w:sz w:val="40"/>
+                <w:szCs w:val="40"/>
+              </w:rPr>
+            </w:pPr>
+          </w:p>
+        </w:tc>
+        <w:tc>
+          <w:tcPr>
+            <w:tcW w:w="1440" w:type="dxa"/>
+          </w:tcPr>
+          <w:p>
+            <w:pPr>
+              <w:rPr>
+                <w:rFonts w:ascii="Times New Roman" w:hAnsi="Times New Roman"/>
+                <w:b/>
+                <w:sz w:val="40"/>
+                <w:szCs w:val="40"/>
+              </w:rPr>
+            </w:pPr>
+          </w:p>
+        </w:tc>
+        <w:tc>
+          <w:tcPr>
+            <w:tcW w:w="2430" w:type="dxa"/>
           </w:tcPr>
           <w:p>
             <w:pPr>
@@ -401,15 +401,15 @@
               <w:jc w:val="center"/>
               <w:rPr>
                 <w:rFonts w:ascii="Times New Roman" w:hAnsi="Times New Roman"/>
-                <w:sz w:val="40"/>
-                <w:szCs w:val="40"/>
+                <w:sz w:val="28"/>
+                <w:szCs w:val="28"/>
               </w:rPr>
             </w:pPr>
             <w:r>
               <w:rPr>
                 <w:rFonts w:ascii="Times New Roman" w:hAnsi="Times New Roman"/>
-                <w:sz w:val="40"/>
-                <w:szCs w:val="40"/>
+                <w:sz w:val="28"/>
+                <w:szCs w:val="28"/>
               </w:rPr>
               <w:t>2</w:t>
             </w:r>
@@ -417,52 +417,52 @@
         </w:tc>
         <w:tc>
           <w:tcPr>
-            <w:tcW w:w="2339" w:type="dxa"/>
-          </w:tcPr>
-          <w:p>
-            <w:pPr>
-              <w:rPr>
-                <w:rFonts w:ascii="Times New Roman" w:hAnsi="Times New Roman"/>
-                <w:b/>
-                <w:sz w:val="40"/>
-                <w:szCs w:val="40"/>
-              </w:rPr>
-            </w:pPr>
-          </w:p>
-        </w:tc>
-        <w:tc>
-          <w:tcPr>
-            <w:tcW w:w="2725" w:type="dxa"/>
-          </w:tcPr>
-          <w:p>
-            <w:pPr>
-              <w:rPr>
-                <w:rFonts w:ascii="Times New Roman" w:hAnsi="Times New Roman"/>
-                <w:b/>
-                <w:sz w:val="40"/>
-                <w:szCs w:val="40"/>
-              </w:rPr>
-            </w:pPr>
-          </w:p>
-        </w:tc>
-        <w:tc>
-          <w:tcPr>
-            <w:tcW w:w="1296" w:type="dxa"/>
-          </w:tcPr>
-          <w:p>
-            <w:pPr>
-              <w:rPr>
-                <w:rFonts w:ascii="Times New Roman" w:hAnsi="Times New Roman"/>
-                <w:b/>
-                <w:sz w:val="40"/>
-                <w:szCs w:val="40"/>
-              </w:rPr>
-            </w:pPr>
-          </w:p>
-        </w:tc>
-        <w:tc>
-          <w:tcPr>
-            <w:tcW w:w="3024" w:type="dxa"/>
+            <w:tcW w:w="3084" w:type="dxa"/>
+          </w:tcPr>
+          <w:p>
+            <w:pPr>
+              <w:rPr>
+                <w:rFonts w:ascii="Times New Roman" w:hAnsi="Times New Roman"/>
+                <w:b/>
+                <w:sz w:val="40"/>
+                <w:szCs w:val="40"/>
+              </w:rPr>
+            </w:pPr>
+          </w:p>
+        </w:tc>
+        <w:tc>
+          <w:tcPr>
+            <w:tcW w:w="2430" w:type="dxa"/>
+          </w:tcPr>
+          <w:p>
+            <w:pPr>
+              <w:rPr>
+                <w:rFonts w:ascii="Times New Roman" w:hAnsi="Times New Roman"/>
+                <w:b/>
+                <w:sz w:val="40"/>
+                <w:szCs w:val="40"/>
+              </w:rPr>
+            </w:pPr>
+          </w:p>
+        </w:tc>
+        <w:tc>
+          <w:tcPr>
+            <w:tcW w:w="1440" w:type="dxa"/>
+          </w:tcPr>
+          <w:p>
+            <w:pPr>
+              <w:rPr>
+                <w:rFonts w:ascii="Times New Roman" w:hAnsi="Times New Roman"/>
+                <w:b/>
+                <w:sz w:val="40"/>
+                <w:szCs w:val="40"/>
+              </w:rPr>
+            </w:pPr>
+          </w:p>
+        </w:tc>
+        <w:tc>
+          <w:tcPr>
+            <w:tcW w:w="2430" w:type="dxa"/>
           </w:tcPr>
           <w:p>
             <w:pPr>
@@ -489,15 +489,15 @@
               <w:jc w:val="center"/>
               <w:rPr>
                 <w:rFonts w:ascii="Times New Roman" w:hAnsi="Times New Roman"/>
-                <w:sz w:val="40"/>
-                <w:szCs w:val="40"/>
+                <w:sz w:val="28"/>
+                <w:szCs w:val="28"/>
               </w:rPr>
             </w:pPr>
             <w:r>
               <w:rPr>
                 <w:rFonts w:ascii="Times New Roman" w:hAnsi="Times New Roman"/>
-                <w:sz w:val="40"/>
-                <w:szCs w:val="40"/>
+                <w:sz w:val="28"/>
+                <w:szCs w:val="28"/>
               </w:rPr>
               <w:t>3</w:t>
             </w:r>
@@ -505,52 +505,54 @@
         </w:tc>
         <w:tc>
           <w:tcPr>
-            <w:tcW w:w="2339" w:type="dxa"/>
-          </w:tcPr>
-          <w:p>
-            <w:pPr>
-              <w:rPr>
-                <w:rFonts w:ascii="Times New Roman" w:hAnsi="Times New Roman"/>
-                <w:b/>
-                <w:sz w:val="40"/>
-                <w:szCs w:val="40"/>
-              </w:rPr>
-            </w:pPr>
-          </w:p>
-        </w:tc>
-        <w:tc>
-          <w:tcPr>
-            <w:tcW w:w="2725" w:type="dxa"/>
-          </w:tcPr>
-          <w:p>
-            <w:pPr>
-              <w:rPr>
-                <w:rFonts w:ascii="Times New Roman" w:hAnsi="Times New Roman"/>
-                <w:b/>
-                <w:sz w:val="40"/>
-                <w:szCs w:val="40"/>
-              </w:rPr>
-            </w:pPr>
-          </w:p>
-        </w:tc>
-        <w:tc>
-          <w:tcPr>
-            <w:tcW w:w="1296" w:type="dxa"/>
-          </w:tcPr>
-          <w:p>
-            <w:pPr>
-              <w:rPr>
-                <w:rFonts w:ascii="Times New Roman" w:hAnsi="Times New Roman"/>
-                <w:b/>
-                <w:sz w:val="40"/>
-                <w:szCs w:val="40"/>
-              </w:rPr>
-            </w:pPr>
-          </w:p>
-        </w:tc>
-        <w:tc>
-          <w:tcPr>
-            <w:tcW w:w="3024" w:type="dxa"/>
+            <w:tcW w:w="3084" w:type="dxa"/>
+          </w:tcPr>
+          <w:p>
+            <w:pPr>
+              <w:rPr>
+                <w:rFonts w:ascii="Times New Roman" w:hAnsi="Times New Roman"/>
+                <w:b/>
+                <w:sz w:val="40"/>
+                <w:szCs w:val="40"/>
+              </w:rPr>
+            </w:pPr>
+            <w:bookmarkStart w:id="0" w:name="_GoBack"/>
+            <w:bookmarkEnd w:id="0"/>
+          </w:p>
+        </w:tc>
+        <w:tc>
+          <w:tcPr>
+            <w:tcW w:w="2430" w:type="dxa"/>
+          </w:tcPr>
+          <w:p>
+            <w:pPr>
+              <w:rPr>
+                <w:rFonts w:ascii="Times New Roman" w:hAnsi="Times New Roman"/>
+                <w:b/>
+                <w:sz w:val="40"/>
+                <w:szCs w:val="40"/>
+              </w:rPr>
+            </w:pPr>
+          </w:p>
+        </w:tc>
+        <w:tc>
+          <w:tcPr>
+            <w:tcW w:w="1440" w:type="dxa"/>
+          </w:tcPr>
+          <w:p>
+            <w:pPr>
+              <w:rPr>
+                <w:rFonts w:ascii="Times New Roman" w:hAnsi="Times New Roman"/>
+                <w:b/>
+                <w:sz w:val="40"/>
+                <w:szCs w:val="40"/>
+              </w:rPr>
+            </w:pPr>
+          </w:p>
+        </w:tc>
+        <w:tc>
+          <w:tcPr>
+            <w:tcW w:w="2430" w:type="dxa"/>
           </w:tcPr>
           <w:p>
             <w:pPr>
@@ -577,15 +579,15 @@
               <w:jc w:val="center"/>
               <w:rPr>
                 <w:rFonts w:ascii="Times New Roman" w:hAnsi="Times New Roman"/>
-                <w:sz w:val="40"/>
-                <w:szCs w:val="40"/>
+                <w:sz w:val="28"/>
+                <w:szCs w:val="28"/>
               </w:rPr>
             </w:pPr>
             <w:r>
               <w:rPr>
                 <w:rFonts w:ascii="Times New Roman" w:hAnsi="Times New Roman"/>
-                <w:sz w:val="40"/>
-                <w:szCs w:val="40"/>
+                <w:sz w:val="28"/>
+                <w:szCs w:val="28"/>
               </w:rPr>
               <w:t>4</w:t>
             </w:r>
@@ -593,52 +595,52 @@
         </w:tc>
         <w:tc>
           <w:tcPr>
-            <w:tcW w:w="2339" w:type="dxa"/>
-          </w:tcPr>
-          <w:p>
-            <w:pPr>
-              <w:rPr>
-                <w:rFonts w:ascii="Times New Roman" w:hAnsi="Times New Roman"/>
-                <w:b/>
-                <w:sz w:val="40"/>
-                <w:szCs w:val="40"/>
-              </w:rPr>
-            </w:pPr>
-          </w:p>
-        </w:tc>
-        <w:tc>
-          <w:tcPr>
-            <w:tcW w:w="2725" w:type="dxa"/>
-          </w:tcPr>
-          <w:p>
-            <w:pPr>
-              <w:rPr>
-                <w:rFonts w:ascii="Times New Roman" w:hAnsi="Times New Roman"/>
-                <w:b/>
-                <w:sz w:val="40"/>
-                <w:szCs w:val="40"/>
-              </w:rPr>
-            </w:pPr>
-          </w:p>
-        </w:tc>
-        <w:tc>
-          <w:tcPr>
-            <w:tcW w:w="1296" w:type="dxa"/>
-          </w:tcPr>
-          <w:p>
-            <w:pPr>
-              <w:rPr>
-                <w:rFonts w:ascii="Times New Roman" w:hAnsi="Times New Roman"/>
-                <w:b/>
-                <w:sz w:val="40"/>
-                <w:szCs w:val="40"/>
-              </w:rPr>
-            </w:pPr>
-          </w:p>
-        </w:tc>
-        <w:tc>
-          <w:tcPr>
-            <w:tcW w:w="3024" w:type="dxa"/>
+            <w:tcW w:w="3084" w:type="dxa"/>
+          </w:tcPr>
+          <w:p>
+            <w:pPr>
+              <w:rPr>
+                <w:rFonts w:ascii="Times New Roman" w:hAnsi="Times New Roman"/>
+                <w:b/>
+                <w:sz w:val="40"/>
+                <w:szCs w:val="40"/>
+              </w:rPr>
+            </w:pPr>
+          </w:p>
+        </w:tc>
+        <w:tc>
+          <w:tcPr>
+            <w:tcW w:w="2430" w:type="dxa"/>
+          </w:tcPr>
+          <w:p>
+            <w:pPr>
+              <w:rPr>
+                <w:rFonts w:ascii="Times New Roman" w:hAnsi="Times New Roman"/>
+                <w:b/>
+                <w:sz w:val="40"/>
+                <w:szCs w:val="40"/>
+              </w:rPr>
+            </w:pPr>
+          </w:p>
+        </w:tc>
+        <w:tc>
+          <w:tcPr>
+            <w:tcW w:w="1440" w:type="dxa"/>
+          </w:tcPr>
+          <w:p>
+            <w:pPr>
+              <w:rPr>
+                <w:rFonts w:ascii="Times New Roman" w:hAnsi="Times New Roman"/>
+                <w:b/>
+                <w:sz w:val="40"/>
+                <w:szCs w:val="40"/>
+              </w:rPr>
+            </w:pPr>
+          </w:p>
+        </w:tc>
+        <w:tc>
+          <w:tcPr>
+            <w:tcW w:w="2430" w:type="dxa"/>
           </w:tcPr>
           <w:p>
             <w:pPr>
@@ -665,15 +667,15 @@
               <w:jc w:val="center"/>
               <w:rPr>
                 <w:rFonts w:ascii="Times New Roman" w:hAnsi="Times New Roman"/>
-                <w:sz w:val="40"/>
-                <w:szCs w:val="40"/>
+                <w:sz w:val="28"/>
+                <w:szCs w:val="28"/>
               </w:rPr>
             </w:pPr>
             <w:r>
               <w:rPr>
                 <w:rFonts w:ascii="Times New Roman" w:hAnsi="Times New Roman"/>
-                <w:sz w:val="40"/>
-                <w:szCs w:val="40"/>
+                <w:sz w:val="28"/>
+                <w:szCs w:val="28"/>
               </w:rPr>
               <w:t>5</w:t>
             </w:r>
@@ -681,52 +683,52 @@
         </w:tc>
         <w:tc>
           <w:tcPr>
-            <w:tcW w:w="2339" w:type="dxa"/>
-          </w:tcPr>
-          <w:p>
-            <w:pPr>
-              <w:rPr>
-                <w:rFonts w:ascii="Times New Roman" w:hAnsi="Times New Roman"/>
-                <w:b/>
-                <w:sz w:val="40"/>
-                <w:szCs w:val="40"/>
-              </w:rPr>
-            </w:pPr>
-          </w:p>
-        </w:tc>
-        <w:tc>
-          <w:tcPr>
-            <w:tcW w:w="2725" w:type="dxa"/>
-          </w:tcPr>
-          <w:p>
-            <w:pPr>
-              <w:rPr>
-                <w:rFonts w:ascii="Times New Roman" w:hAnsi="Times New Roman"/>
-                <w:b/>
-                <w:sz w:val="40"/>
-                <w:szCs w:val="40"/>
-              </w:rPr>
-            </w:pPr>
-          </w:p>
-        </w:tc>
-        <w:tc>
-          <w:tcPr>
-            <w:tcW w:w="1296" w:type="dxa"/>
-          </w:tcPr>
-          <w:p>
-            <w:pPr>
-              <w:rPr>
-                <w:rFonts w:ascii="Times New Roman" w:hAnsi="Times New Roman"/>
-                <w:b/>
-                <w:sz w:val="40"/>
-                <w:szCs w:val="40"/>
-              </w:rPr>
-            </w:pPr>
-          </w:p>
-        </w:tc>
-        <w:tc>
-          <w:tcPr>
-            <w:tcW w:w="3024" w:type="dxa"/>
+            <w:tcW w:w="3084" w:type="dxa"/>
+          </w:tcPr>
+          <w:p>
+            <w:pPr>
+              <w:rPr>
+                <w:rFonts w:ascii="Times New Roman" w:hAnsi="Times New Roman"/>
+                <w:b/>
+                <w:sz w:val="40"/>
+                <w:szCs w:val="40"/>
+              </w:rPr>
+            </w:pPr>
+          </w:p>
+        </w:tc>
+        <w:tc>
+          <w:tcPr>
+            <w:tcW w:w="2430" w:type="dxa"/>
+          </w:tcPr>
+          <w:p>
+            <w:pPr>
+              <w:rPr>
+                <w:rFonts w:ascii="Times New Roman" w:hAnsi="Times New Roman"/>
+                <w:b/>
+                <w:sz w:val="40"/>
+                <w:szCs w:val="40"/>
+              </w:rPr>
+            </w:pPr>
+          </w:p>
+        </w:tc>
+        <w:tc>
+          <w:tcPr>
+            <w:tcW w:w="1440" w:type="dxa"/>
+          </w:tcPr>
+          <w:p>
+            <w:pPr>
+              <w:rPr>
+                <w:rFonts w:ascii="Times New Roman" w:hAnsi="Times New Roman"/>
+                <w:b/>
+                <w:sz w:val="40"/>
+                <w:szCs w:val="40"/>
+              </w:rPr>
+            </w:pPr>
+          </w:p>
+        </w:tc>
+        <w:tc>
+          <w:tcPr>
+            <w:tcW w:w="2430" w:type="dxa"/>
           </w:tcPr>
           <w:p>
             <w:pPr>
@@ -753,15 +755,15 @@
               <w:jc w:val="center"/>
               <w:rPr>
                 <w:rFonts w:ascii="Times New Roman" w:hAnsi="Times New Roman"/>
-                <w:sz w:val="40"/>
-                <w:szCs w:val="40"/>
+                <w:sz w:val="28"/>
+                <w:szCs w:val="28"/>
               </w:rPr>
             </w:pPr>
             <w:r>
               <w:rPr>
                 <w:rFonts w:ascii="Times New Roman" w:hAnsi="Times New Roman"/>
-                <w:sz w:val="40"/>
-                <w:szCs w:val="40"/>
+                <w:sz w:val="28"/>
+                <w:szCs w:val="28"/>
               </w:rPr>
               <w:t>6</w:t>
             </w:r>
@@ -769,52 +771,52 @@
         </w:tc>
         <w:tc>
           <w:tcPr>
-            <w:tcW w:w="2339" w:type="dxa"/>
-          </w:tcPr>
-          <w:p>
-            <w:pPr>
-              <w:rPr>
-                <w:rFonts w:ascii="Times New Roman" w:hAnsi="Times New Roman"/>
-                <w:b/>
-                <w:sz w:val="40"/>
-                <w:szCs w:val="40"/>
-              </w:rPr>
-            </w:pPr>
-          </w:p>
-        </w:tc>
-        <w:tc>
-          <w:tcPr>
-            <w:tcW w:w="2725" w:type="dxa"/>
-          </w:tcPr>
-          <w:p>
-            <w:pPr>
-              <w:rPr>
-                <w:rFonts w:ascii="Times New Roman" w:hAnsi="Times New Roman"/>
-                <w:b/>
-                <w:sz w:val="40"/>
-                <w:szCs w:val="40"/>
-              </w:rPr>
-            </w:pPr>
-          </w:p>
-        </w:tc>
-        <w:tc>
-          <w:tcPr>
-            <w:tcW w:w="1296" w:type="dxa"/>
-          </w:tcPr>
-          <w:p>
-            <w:pPr>
-              <w:rPr>
-                <w:rFonts w:ascii="Times New Roman" w:hAnsi="Times New Roman"/>
-                <w:b/>
-                <w:sz w:val="40"/>
-                <w:szCs w:val="40"/>
-              </w:rPr>
-            </w:pPr>
-          </w:p>
-        </w:tc>
-        <w:tc>
-          <w:tcPr>
-            <w:tcW w:w="3024" w:type="dxa"/>
+            <w:tcW w:w="3084" w:type="dxa"/>
+          </w:tcPr>
+          <w:p>
+            <w:pPr>
+              <w:rPr>
+                <w:rFonts w:ascii="Times New Roman" w:hAnsi="Times New Roman"/>
+                <w:b/>
+                <w:sz w:val="40"/>
+                <w:szCs w:val="40"/>
+              </w:rPr>
+            </w:pPr>
+          </w:p>
+        </w:tc>
+        <w:tc>
+          <w:tcPr>
+            <w:tcW w:w="2430" w:type="dxa"/>
+          </w:tcPr>
+          <w:p>
+            <w:pPr>
+              <w:rPr>
+                <w:rFonts w:ascii="Times New Roman" w:hAnsi="Times New Roman"/>
+                <w:b/>
+                <w:sz w:val="40"/>
+                <w:szCs w:val="40"/>
+              </w:rPr>
+            </w:pPr>
+          </w:p>
+        </w:tc>
+        <w:tc>
+          <w:tcPr>
+            <w:tcW w:w="1440" w:type="dxa"/>
+          </w:tcPr>
+          <w:p>
+            <w:pPr>
+              <w:rPr>
+                <w:rFonts w:ascii="Times New Roman" w:hAnsi="Times New Roman"/>
+                <w:b/>
+                <w:sz w:val="40"/>
+                <w:szCs w:val="40"/>
+              </w:rPr>
+            </w:pPr>
+          </w:p>
+        </w:tc>
+        <w:tc>
+          <w:tcPr>
+            <w:tcW w:w="2430" w:type="dxa"/>
           </w:tcPr>
           <w:p>
             <w:pPr>
@@ -841,15 +843,15 @@
               <w:jc w:val="center"/>
               <w:rPr>
                 <w:rFonts w:ascii="Times New Roman" w:hAnsi="Times New Roman"/>
-                <w:sz w:val="40"/>
-                <w:szCs w:val="40"/>
+                <w:sz w:val="28"/>
+                <w:szCs w:val="28"/>
               </w:rPr>
             </w:pPr>
             <w:r>
               <w:rPr>
                 <w:rFonts w:ascii="Times New Roman" w:hAnsi="Times New Roman"/>
-                <w:sz w:val="40"/>
-                <w:szCs w:val="40"/>
+                <w:sz w:val="28"/>
+                <w:szCs w:val="28"/>
               </w:rPr>
               <w:t>7</w:t>
             </w:r>
@@ -857,52 +859,52 @@
         </w:tc>
         <w:tc>
           <w:tcPr>
-            <w:tcW w:w="2339" w:type="dxa"/>
-          </w:tcPr>
-          <w:p>
-            <w:pPr>
-              <w:rPr>
-                <w:rFonts w:ascii="Times New Roman" w:hAnsi="Times New Roman"/>
-                <w:b/>
-                <w:sz w:val="40"/>
-                <w:szCs w:val="40"/>
-              </w:rPr>
-            </w:pPr>
-          </w:p>
-        </w:tc>
-        <w:tc>
-          <w:tcPr>
-            <w:tcW w:w="2725" w:type="dxa"/>
-          </w:tcPr>
-          <w:p>
-            <w:pPr>
-              <w:rPr>
-                <w:rFonts w:ascii="Times New Roman" w:hAnsi="Times New Roman"/>
-                <w:b/>
-                <w:sz w:val="40"/>
-                <w:szCs w:val="40"/>
-              </w:rPr>
-            </w:pPr>
-          </w:p>
-        </w:tc>
-        <w:tc>
-          <w:tcPr>
-            <w:tcW w:w="1296" w:type="dxa"/>
-          </w:tcPr>
-          <w:p>
-            <w:pPr>
-              <w:rPr>
-                <w:rFonts w:ascii="Times New Roman" w:hAnsi="Times New Roman"/>
-                <w:b/>
-                <w:sz w:val="40"/>
-                <w:szCs w:val="40"/>
-              </w:rPr>
-            </w:pPr>
-          </w:p>
-        </w:tc>
-        <w:tc>
-          <w:tcPr>
-            <w:tcW w:w="3024" w:type="dxa"/>
+            <w:tcW w:w="3084" w:type="dxa"/>
+          </w:tcPr>
+          <w:p>
+            <w:pPr>
+              <w:rPr>
+                <w:rFonts w:ascii="Times New Roman" w:hAnsi="Times New Roman"/>
+                <w:b/>
+                <w:sz w:val="40"/>
+                <w:szCs w:val="40"/>
+              </w:rPr>
+            </w:pPr>
+          </w:p>
+        </w:tc>
+        <w:tc>
+          <w:tcPr>
+            <w:tcW w:w="2430" w:type="dxa"/>
+          </w:tcPr>
+          <w:p>
+            <w:pPr>
+              <w:rPr>
+                <w:rFonts w:ascii="Times New Roman" w:hAnsi="Times New Roman"/>
+                <w:b/>
+                <w:sz w:val="40"/>
+                <w:szCs w:val="40"/>
+              </w:rPr>
+            </w:pPr>
+          </w:p>
+        </w:tc>
+        <w:tc>
+          <w:tcPr>
+            <w:tcW w:w="1440" w:type="dxa"/>
+          </w:tcPr>
+          <w:p>
+            <w:pPr>
+              <w:rPr>
+                <w:rFonts w:ascii="Times New Roman" w:hAnsi="Times New Roman"/>
+                <w:b/>
+                <w:sz w:val="40"/>
+                <w:szCs w:val="40"/>
+              </w:rPr>
+            </w:pPr>
+          </w:p>
+        </w:tc>
+        <w:tc>
+          <w:tcPr>
+            <w:tcW w:w="2430" w:type="dxa"/>
           </w:tcPr>
           <w:p>
             <w:pPr>
@@ -929,15 +931,15 @@
               <w:jc w:val="center"/>
               <w:rPr>
                 <w:rFonts w:ascii="Times New Roman" w:hAnsi="Times New Roman"/>
-                <w:sz w:val="40"/>
-                <w:szCs w:val="40"/>
+                <w:sz w:val="28"/>
+                <w:szCs w:val="28"/>
               </w:rPr>
             </w:pPr>
             <w:r>
               <w:rPr>
                 <w:rFonts w:ascii="Times New Roman" w:hAnsi="Times New Roman"/>
-                <w:sz w:val="40"/>
-                <w:szCs w:val="40"/>
+                <w:sz w:val="28"/>
+                <w:szCs w:val="28"/>
               </w:rPr>
               <w:t>8</w:t>
             </w:r>
@@ -945,52 +947,52 @@
         </w:tc>
         <w:tc>
           <w:tcPr>
-            <w:tcW w:w="2339" w:type="dxa"/>
-          </w:tcPr>
-          <w:p>
-            <w:pPr>
-              <w:rPr>
-                <w:rFonts w:ascii="Times New Roman" w:hAnsi="Times New Roman"/>
-                <w:b/>
-                <w:sz w:val="40"/>
-                <w:szCs w:val="40"/>
-              </w:rPr>
-            </w:pPr>
-          </w:p>
-        </w:tc>
-        <w:tc>
-          <w:tcPr>
-            <w:tcW w:w="2725" w:type="dxa"/>
-          </w:tcPr>
-          <w:p>
-            <w:pPr>
-              <w:rPr>
-                <w:rFonts w:ascii="Times New Roman" w:hAnsi="Times New Roman"/>
-                <w:b/>
-                <w:sz w:val="40"/>
-                <w:szCs w:val="40"/>
-              </w:rPr>
-            </w:pPr>
-          </w:p>
-        </w:tc>
-        <w:tc>
-          <w:tcPr>
-            <w:tcW w:w="1296" w:type="dxa"/>
-          </w:tcPr>
-          <w:p>
-            <w:pPr>
-              <w:rPr>
-                <w:rFonts w:ascii="Times New Roman" w:hAnsi="Times New Roman"/>
-                <w:b/>
-                <w:sz w:val="40"/>
-                <w:szCs w:val="40"/>
-              </w:rPr>
-            </w:pPr>
-          </w:p>
-        </w:tc>
-        <w:tc>
-          <w:tcPr>
-            <w:tcW w:w="3024" w:type="dxa"/>
+            <w:tcW w:w="3084" w:type="dxa"/>
+          </w:tcPr>
+          <w:p>
+            <w:pPr>
+              <w:rPr>
+                <w:rFonts w:ascii="Times New Roman" w:hAnsi="Times New Roman"/>
+                <w:b/>
+                <w:sz w:val="40"/>
+                <w:szCs w:val="40"/>
+              </w:rPr>
+            </w:pPr>
+          </w:p>
+        </w:tc>
+        <w:tc>
+          <w:tcPr>
+            <w:tcW w:w="2430" w:type="dxa"/>
+          </w:tcPr>
+          <w:p>
+            <w:pPr>
+              <w:rPr>
+                <w:rFonts w:ascii="Times New Roman" w:hAnsi="Times New Roman"/>
+                <w:b/>
+                <w:sz w:val="40"/>
+                <w:szCs w:val="40"/>
+              </w:rPr>
+            </w:pPr>
+          </w:p>
+        </w:tc>
+        <w:tc>
+          <w:tcPr>
+            <w:tcW w:w="1440" w:type="dxa"/>
+          </w:tcPr>
+          <w:p>
+            <w:pPr>
+              <w:rPr>
+                <w:rFonts w:ascii="Times New Roman" w:hAnsi="Times New Roman"/>
+                <w:b/>
+                <w:sz w:val="40"/>
+                <w:szCs w:val="40"/>
+              </w:rPr>
+            </w:pPr>
+          </w:p>
+        </w:tc>
+        <w:tc>
+          <w:tcPr>
+            <w:tcW w:w="2430" w:type="dxa"/>
           </w:tcPr>
           <w:p>
             <w:pPr>
@@ -1017,15 +1019,15 @@
               <w:jc w:val="center"/>
               <w:rPr>
                 <w:rFonts w:ascii="Times New Roman" w:hAnsi="Times New Roman"/>
-                <w:sz w:val="40"/>
-                <w:szCs w:val="40"/>
+                <w:sz w:val="28"/>
+                <w:szCs w:val="28"/>
               </w:rPr>
             </w:pPr>
             <w:r>
               <w:rPr>
                 <w:rFonts w:ascii="Times New Roman" w:hAnsi="Times New Roman"/>
-                <w:sz w:val="40"/>
-                <w:szCs w:val="40"/>
+                <w:sz w:val="28"/>
+                <w:szCs w:val="28"/>
               </w:rPr>
               <w:t>9</w:t>
             </w:r>
@@ -1033,54 +1035,52 @@
         </w:tc>
         <w:tc>
           <w:tcPr>
-            <w:tcW w:w="2339" w:type="dxa"/>
-          </w:tcPr>
-          <w:p>
-            <w:pPr>
-              <w:rPr>
-                <w:rFonts w:ascii="Times New Roman" w:hAnsi="Times New Roman"/>
-                <w:b/>
-                <w:sz w:val="40"/>
-                <w:szCs w:val="40"/>
-              </w:rPr>
-            </w:pPr>
-          </w:p>
-        </w:tc>
-        <w:tc>
-          <w:tcPr>
-            <w:tcW w:w="2725" w:type="dxa"/>
-          </w:tcPr>
-          <w:p>
-            <w:pPr>
-              <w:rPr>
-                <w:rFonts w:ascii="Times New Roman" w:hAnsi="Times New Roman"/>
-                <w:b/>
-                <w:sz w:val="40"/>
-                <w:szCs w:val="40"/>
-              </w:rPr>
-            </w:pPr>
-            <w:bookmarkStart w:id="0" w:name="_GoBack"/>
-            <w:bookmarkEnd w:id="0"/>
-          </w:p>
-        </w:tc>
-        <w:tc>
-          <w:tcPr>
-            <w:tcW w:w="1296" w:type="dxa"/>
-          </w:tcPr>
-          <w:p>
-            <w:pPr>
-              <w:rPr>
-                <w:rFonts w:ascii="Times New Roman" w:hAnsi="Times New Roman"/>
-                <w:b/>
-                <w:sz w:val="40"/>
-                <w:szCs w:val="40"/>
-              </w:rPr>
-            </w:pPr>
-          </w:p>
-        </w:tc>
-        <w:tc>
-          <w:tcPr>
-            <w:tcW w:w="3024" w:type="dxa"/>
+            <w:tcW w:w="3084" w:type="dxa"/>
+          </w:tcPr>
+          <w:p>
+            <w:pPr>
+              <w:rPr>
+                <w:rFonts w:ascii="Times New Roman" w:hAnsi="Times New Roman"/>
+                <w:b/>
+                <w:sz w:val="40"/>
+                <w:szCs w:val="40"/>
+              </w:rPr>
+            </w:pPr>
+          </w:p>
+        </w:tc>
+        <w:tc>
+          <w:tcPr>
+            <w:tcW w:w="2430" w:type="dxa"/>
+          </w:tcPr>
+          <w:p>
+            <w:pPr>
+              <w:rPr>
+                <w:rFonts w:ascii="Times New Roman" w:hAnsi="Times New Roman"/>
+                <w:b/>
+                <w:sz w:val="40"/>
+                <w:szCs w:val="40"/>
+              </w:rPr>
+            </w:pPr>
+          </w:p>
+        </w:tc>
+        <w:tc>
+          <w:tcPr>
+            <w:tcW w:w="1440" w:type="dxa"/>
+          </w:tcPr>
+          <w:p>
+            <w:pPr>
+              <w:rPr>
+                <w:rFonts w:ascii="Times New Roman" w:hAnsi="Times New Roman"/>
+                <w:b/>
+                <w:sz w:val="40"/>
+                <w:szCs w:val="40"/>
+              </w:rPr>
+            </w:pPr>
+          </w:p>
+        </w:tc>
+        <w:tc>
+          <w:tcPr>
+            <w:tcW w:w="2430" w:type="dxa"/>
           </w:tcPr>
           <w:p>
             <w:pPr>
@@ -1107,15 +1107,15 @@
               <w:jc w:val="center"/>
               <w:rPr>
                 <w:rFonts w:ascii="Times New Roman" w:hAnsi="Times New Roman"/>
-                <w:sz w:val="40"/>
-                <w:szCs w:val="40"/>
+                <w:sz w:val="28"/>
+                <w:szCs w:val="28"/>
               </w:rPr>
             </w:pPr>
             <w:r>
               <w:rPr>
                 <w:rFonts w:ascii="Times New Roman" w:hAnsi="Times New Roman"/>
-                <w:sz w:val="40"/>
-                <w:szCs w:val="40"/>
+                <w:sz w:val="28"/>
+                <w:szCs w:val="28"/>
               </w:rPr>
               <w:t>10</w:t>
             </w:r>
@@ -1123,52 +1123,52 @@
         </w:tc>
         <w:tc>
           <w:tcPr>
-            <w:tcW w:w="2339" w:type="dxa"/>
-          </w:tcPr>
-          <w:p>
-            <w:pPr>
-              <w:rPr>
-                <w:rFonts w:ascii="Times New Roman" w:hAnsi="Times New Roman"/>
-                <w:b/>
-                <w:sz w:val="40"/>
-                <w:szCs w:val="40"/>
-              </w:rPr>
-            </w:pPr>
-          </w:p>
-        </w:tc>
-        <w:tc>
-          <w:tcPr>
-            <w:tcW w:w="2725" w:type="dxa"/>
-          </w:tcPr>
-          <w:p>
-            <w:pPr>
-              <w:rPr>
-                <w:rFonts w:ascii="Times New Roman" w:hAnsi="Times New Roman"/>
-                <w:b/>
-                <w:sz w:val="40"/>
-                <w:szCs w:val="40"/>
-              </w:rPr>
-            </w:pPr>
-          </w:p>
-        </w:tc>
-        <w:tc>
-          <w:tcPr>
-            <w:tcW w:w="1296" w:type="dxa"/>
-          </w:tcPr>
-          <w:p>
-            <w:pPr>
-              <w:rPr>
-                <w:rFonts w:ascii="Times New Roman" w:hAnsi="Times New Roman"/>
-                <w:b/>
-                <w:sz w:val="40"/>
-                <w:szCs w:val="40"/>
-              </w:rPr>
-            </w:pPr>
-          </w:p>
-        </w:tc>
-        <w:tc>
-          <w:tcPr>
-            <w:tcW w:w="3024" w:type="dxa"/>
+            <w:tcW w:w="3084" w:type="dxa"/>
+          </w:tcPr>
+          <w:p>
+            <w:pPr>
+              <w:rPr>
+                <w:rFonts w:ascii="Times New Roman" w:hAnsi="Times New Roman"/>
+                <w:b/>
+                <w:sz w:val="40"/>
+                <w:szCs w:val="40"/>
+              </w:rPr>
+            </w:pPr>
+          </w:p>
+        </w:tc>
+        <w:tc>
+          <w:tcPr>
+            <w:tcW w:w="2430" w:type="dxa"/>
+          </w:tcPr>
+          <w:p>
+            <w:pPr>
+              <w:rPr>
+                <w:rFonts w:ascii="Times New Roman" w:hAnsi="Times New Roman"/>
+                <w:b/>
+                <w:sz w:val="40"/>
+                <w:szCs w:val="40"/>
+              </w:rPr>
+            </w:pPr>
+          </w:p>
+        </w:tc>
+        <w:tc>
+          <w:tcPr>
+            <w:tcW w:w="1440" w:type="dxa"/>
+          </w:tcPr>
+          <w:p>
+            <w:pPr>
+              <w:rPr>
+                <w:rFonts w:ascii="Times New Roman" w:hAnsi="Times New Roman"/>
+                <w:b/>
+                <w:sz w:val="40"/>
+                <w:szCs w:val="40"/>
+              </w:rPr>
+            </w:pPr>
+          </w:p>
+        </w:tc>
+        <w:tc>
+          <w:tcPr>
+            <w:tcW w:w="2430" w:type="dxa"/>
           </w:tcPr>
           <w:p>
             <w:pPr>
@@ -1195,15 +1195,15 @@
               <w:jc w:val="center"/>
               <w:rPr>
                 <w:rFonts w:ascii="Times New Roman" w:hAnsi="Times New Roman"/>
-                <w:sz w:val="40"/>
-                <w:szCs w:val="40"/>
+                <w:sz w:val="28"/>
+                <w:szCs w:val="28"/>
               </w:rPr>
             </w:pPr>
             <w:r>
               <w:rPr>
                 <w:rFonts w:ascii="Times New Roman" w:hAnsi="Times New Roman"/>
-                <w:sz w:val="40"/>
-                <w:szCs w:val="40"/>
+                <w:sz w:val="28"/>
+                <w:szCs w:val="28"/>
               </w:rPr>
               <w:t>11</w:t>
             </w:r>
@@ -1211,52 +1211,52 @@
         </w:tc>
         <w:tc>
           <w:tcPr>
-            <w:tcW w:w="2339" w:type="dxa"/>
-          </w:tcPr>
-          <w:p>
-            <w:pPr>
-              <w:rPr>
-                <w:rFonts w:ascii="Times New Roman" w:hAnsi="Times New Roman"/>
-                <w:b/>
-                <w:sz w:val="40"/>
-                <w:szCs w:val="40"/>
-              </w:rPr>
-            </w:pPr>
-          </w:p>
-        </w:tc>
-        <w:tc>
-          <w:tcPr>
-            <w:tcW w:w="2725" w:type="dxa"/>
-          </w:tcPr>
-          <w:p>
-            <w:pPr>
-              <w:rPr>
-                <w:rFonts w:ascii="Times New Roman" w:hAnsi="Times New Roman"/>
-                <w:b/>
-                <w:sz w:val="40"/>
-                <w:szCs w:val="40"/>
-              </w:rPr>
-            </w:pPr>
-          </w:p>
-        </w:tc>
-        <w:tc>
-          <w:tcPr>
-            <w:tcW w:w="1296" w:type="dxa"/>
-          </w:tcPr>
-          <w:p>
-            <w:pPr>
-              <w:rPr>
-                <w:rFonts w:ascii="Times New Roman" w:hAnsi="Times New Roman"/>
-                <w:b/>
-                <w:sz w:val="40"/>
-                <w:szCs w:val="40"/>
-              </w:rPr>
-            </w:pPr>
-          </w:p>
-        </w:tc>
-        <w:tc>
-          <w:tcPr>
-            <w:tcW w:w="3024" w:type="dxa"/>
+            <w:tcW w:w="3084" w:type="dxa"/>
+          </w:tcPr>
+          <w:p>
+            <w:pPr>
+              <w:rPr>
+                <w:rFonts w:ascii="Times New Roman" w:hAnsi="Times New Roman"/>
+                <w:b/>
+                <w:sz w:val="40"/>
+                <w:szCs w:val="40"/>
+              </w:rPr>
+            </w:pPr>
+          </w:p>
+        </w:tc>
+        <w:tc>
+          <w:tcPr>
+            <w:tcW w:w="2430" w:type="dxa"/>
+          </w:tcPr>
+          <w:p>
+            <w:pPr>
+              <w:rPr>
+                <w:rFonts w:ascii="Times New Roman" w:hAnsi="Times New Roman"/>
+                <w:b/>
+                <w:sz w:val="40"/>
+                <w:szCs w:val="40"/>
+              </w:rPr>
+            </w:pPr>
+          </w:p>
+        </w:tc>
+        <w:tc>
+          <w:tcPr>
+            <w:tcW w:w="1440" w:type="dxa"/>
+          </w:tcPr>
+          <w:p>
+            <w:pPr>
+              <w:rPr>
+                <w:rFonts w:ascii="Times New Roman" w:hAnsi="Times New Roman"/>
+                <w:b/>
+                <w:sz w:val="40"/>
+                <w:szCs w:val="40"/>
+              </w:rPr>
+            </w:pPr>
+          </w:p>
+        </w:tc>
+        <w:tc>
+          <w:tcPr>
+            <w:tcW w:w="2430" w:type="dxa"/>
           </w:tcPr>
           <w:p>
             <w:pPr>
@@ -1283,15 +1283,15 @@
               <w:jc w:val="center"/>
               <w:rPr>
                 <w:rFonts w:ascii="Times New Roman" w:hAnsi="Times New Roman"/>
-                <w:sz w:val="40"/>
-                <w:szCs w:val="40"/>
+                <w:sz w:val="28"/>
+                <w:szCs w:val="28"/>
               </w:rPr>
             </w:pPr>
             <w:r>
               <w:rPr>
                 <w:rFonts w:ascii="Times New Roman" w:hAnsi="Times New Roman"/>
-                <w:sz w:val="40"/>
-                <w:szCs w:val="40"/>
+                <w:sz w:val="28"/>
+                <w:szCs w:val="28"/>
               </w:rPr>
               <w:t>12</w:t>
             </w:r>
@@ -1299,52 +1299,52 @@
         </w:tc>
         <w:tc>
           <w:tcPr>
-            <w:tcW w:w="2339" w:type="dxa"/>
-          </w:tcPr>
-          <w:p>
-            <w:pPr>
-              <w:rPr>
-                <w:rFonts w:ascii="Times New Roman" w:hAnsi="Times New Roman"/>
-                <w:b/>
-                <w:sz w:val="40"/>
-                <w:szCs w:val="40"/>
-              </w:rPr>
-            </w:pPr>
-          </w:p>
-        </w:tc>
-        <w:tc>
-          <w:tcPr>
-            <w:tcW w:w="2725" w:type="dxa"/>
-          </w:tcPr>
-          <w:p>
-            <w:pPr>
-              <w:rPr>
-                <w:rFonts w:ascii="Times New Roman" w:hAnsi="Times New Roman"/>
-                <w:b/>
-                <w:sz w:val="40"/>
-                <w:szCs w:val="40"/>
-              </w:rPr>
-            </w:pPr>
-          </w:p>
-        </w:tc>
-        <w:tc>
-          <w:tcPr>
-            <w:tcW w:w="1296" w:type="dxa"/>
-          </w:tcPr>
-          <w:p>
-            <w:pPr>
-              <w:rPr>
-                <w:rFonts w:ascii="Times New Roman" w:hAnsi="Times New Roman"/>
-                <w:b/>
-                <w:sz w:val="40"/>
-                <w:szCs w:val="40"/>
-              </w:rPr>
-            </w:pPr>
-          </w:p>
-        </w:tc>
-        <w:tc>
-          <w:tcPr>
-            <w:tcW w:w="3024" w:type="dxa"/>
+            <w:tcW w:w="3084" w:type="dxa"/>
+          </w:tcPr>
+          <w:p>
+            <w:pPr>
+              <w:rPr>
+                <w:rFonts w:ascii="Times New Roman" w:hAnsi="Times New Roman"/>
+                <w:b/>
+                <w:sz w:val="40"/>
+                <w:szCs w:val="40"/>
+              </w:rPr>
+            </w:pPr>
+          </w:p>
+        </w:tc>
+        <w:tc>
+          <w:tcPr>
+            <w:tcW w:w="2430" w:type="dxa"/>
+          </w:tcPr>
+          <w:p>
+            <w:pPr>
+              <w:rPr>
+                <w:rFonts w:ascii="Times New Roman" w:hAnsi="Times New Roman"/>
+                <w:b/>
+                <w:sz w:val="40"/>
+                <w:szCs w:val="40"/>
+              </w:rPr>
+            </w:pPr>
+          </w:p>
+        </w:tc>
+        <w:tc>
+          <w:tcPr>
+            <w:tcW w:w="1440" w:type="dxa"/>
+          </w:tcPr>
+          <w:p>
+            <w:pPr>
+              <w:rPr>
+                <w:rFonts w:ascii="Times New Roman" w:hAnsi="Times New Roman"/>
+                <w:b/>
+                <w:sz w:val="40"/>
+                <w:szCs w:val="40"/>
+              </w:rPr>
+            </w:pPr>
+          </w:p>
+        </w:tc>
+        <w:tc>
+          <w:tcPr>
+            <w:tcW w:w="2430" w:type="dxa"/>
           </w:tcPr>
           <w:p>
             <w:pPr>

</xml_diff>

<commit_message>
hoan thanh 3.2 phuong an
</commit_message>
<xml_diff>
--- a/src/main/resources/templates/BaoCaoThongTinVeNguoiCoLienQuan.docx
+++ b/src/main/resources/templates/BaoCaoThongTinVeNguoiCoLienQuan.docx
@@ -11,8 +11,6 @@
           <w:sz w:val="28"/>
         </w:rPr>
       </w:pPr>
-      <w:bookmarkStart w:id="0" w:name="_GoBack"/>
-      <w:bookmarkEnd w:id="0"/>
       <w:r>
         <w:rPr>
           <w:rFonts w:ascii="Times New Roman" w:hAnsi="Times New Roman"/>
@@ -1394,14 +1392,21 @@
           <w:rFonts w:ascii="Times New Roman" w:hAnsi="Times New Roman"/>
           <w:sz w:val="28"/>
         </w:rPr>
-        <w:t xml:space="preserve">                                                              </w:t>
+        <w:t xml:space="preserve">                              </w:t>
       </w:r>
       <w:r>
         <w:rPr>
           <w:rFonts w:ascii="Times New Roman" w:hAnsi="Times New Roman"/>
           <w:sz w:val="28"/>
         </w:rPr>
-        <w:t xml:space="preserve">             {{phuong}}, Ngày {{day}} tháng {{month}} năm {{year}}</w:t>
+        <w:t xml:space="preserve">                               </w:t>
+      </w:r>
+      <w:r>
+        <w:rPr>
+          <w:rFonts w:ascii="Times New Roman" w:hAnsi="Times New Roman"/>
+          <w:sz w:val="28"/>
+        </w:rPr>
+        <w:t>{{phuong}}, Ngày {{day}} tháng {{month}} năm {{year}}</w:t>
       </w:r>
     </w:p>
     <w:p>
@@ -1424,7 +1429,7 @@
           <w:rFonts w:ascii="Times New Roman" w:hAnsi="Times New Roman"/>
           <w:sz w:val="28"/>
         </w:rPr>
-        <w:t xml:space="preserve">                              </w:t>
+        <w:t xml:space="preserve">                </w:t>
       </w:r>
       <w:r>
         <w:rPr>
@@ -1457,8 +1462,10 @@
           <w:b/>
           <w:sz w:val="28"/>
         </w:rPr>
-        <w:t xml:space="preserve">                              </w:t>
+        <w:t xml:space="preserve">                </w:t>
       </w:r>
+      <w:bookmarkStart w:id="0" w:name="_GoBack"/>
+      <w:bookmarkEnd w:id="0"/>
       <w:r>
         <w:rPr>
           <w:rFonts w:ascii="Times New Roman" w:hAnsi="Times New Roman"/>

</xml_diff>